<commit_message>
Huacho OCI: punto 2 reforzado (extravío verbal, exigir solución)
Co-Authored-By: Claude Opus 5.5 <noreply@anthropic.com>
Claude-Session: https://claude.ai/code/session_01Ls5dNjYBLNjXxuGTDk7v3H
</commit_message>
<xml_diff>
--- a/carta-reclamo/huacho/Carta_Huacho_OCI_Complemento.docx
+++ b/carta-reclamo/huacho/Carta_Huacho_OCI_Complemento.docx
@@ -211,36 +211,39 @@
         <w:t xml:space="preserve"> </w:t>
       </w:r>
       <w:r>
-        <w:t xml:space="preserve">El extravío</w:t>
-      </w:r>
-      <w:r>
-        <w:t xml:space="preserve"> </w:t>
-      </w:r>
-      <w:r>
-        <w:rPr>
-          <w:bCs/>
-          <w:b/>
-        </w:rPr>
-        <w:t xml:space="preserve">no nos fue comunicado por escrito</w:t>
-      </w:r>
-      <w:r>
-        <w:t xml:space="preserve">. Nos fue informado</w:t>
-      </w:r>
-      <w:r>
-        <w:t xml:space="preserve"> </w:t>
-      </w:r>
-      <w:r>
-        <w:rPr>
-          <w:bCs/>
-          <w:b/>
-        </w:rPr>
-        <w:t xml:space="preserve">de manera verbal</w:t>
-      </w:r>
-      <w:r>
-        <w:t xml:space="preserve"> </w:t>
-      </w:r>
-      <w:r>
-        <w:t xml:space="preserve">por personal de la Oficina de Logística cuando acudimos a la Municipalidad, luego de nuestra visita del</w:t>
+        <w:t xml:space="preserve">La Municipalidad</w:t>
+      </w:r>
+      <w:r>
+        <w:t xml:space="preserve"> </w:t>
+      </w:r>
+      <w:r>
+        <w:rPr>
+          <w:bCs/>
+          <w:b/>
+        </w:rPr>
+        <w:t xml:space="preserve">nunca nos entregó un documento</w:t>
+      </w:r>
+      <w:r>
+        <w:t xml:space="preserve"> </w:t>
+      </w:r>
+      <w:r>
+        <w:t xml:space="preserve">sobre el extravío. Nos lo comunicó</w:t>
+      </w:r>
+      <w:r>
+        <w:t xml:space="preserve"> </w:t>
+      </w:r>
+      <w:r>
+        <w:rPr>
+          <w:bCs/>
+          <w:b/>
+        </w:rPr>
+        <w:t xml:space="preserve">de manera verbal un trabajador de la Oficina de Logística</w:t>
+      </w:r>
+      <w:r>
+        <w:t xml:space="preserve"> </w:t>
+      </w:r>
+      <w:r>
+        <w:t xml:space="preserve">cuando visitamos la entidad, luego de nuestra reunión del</w:t>
       </w:r>
       <w:r>
         <w:t xml:space="preserve"> </w:t>
@@ -256,7 +259,7 @@
         <w:t xml:space="preserve"> </w:t>
       </w:r>
       <w:r>
-        <w:t xml:space="preserve">a la Oficina General de Administración y Finanzas. En esa oportunidad se nos indicó que el expediente había sido derivado a Logística el</w:t>
+        <w:t xml:space="preserve">con la Oficina General de Administración y Finanzas. Se nos dijo que el expediente había sido derivado a Logística el</w:t>
       </w:r>
       <w:r>
         <w:t xml:space="preserve"> </w:t>
@@ -294,39 +297,107 @@
         <w:jc w:val="both"/>
       </w:pPr>
       <w:r>
-        <w:t xml:space="preserve">Dejamos constancia escrita de ese hecho en nuestras cartas a la Municipalidad del</w:t>
-      </w:r>
-      <w:r>
-        <w:t xml:space="preserve"> </w:t>
-      </w:r>
-      <w:r>
-        <w:rPr>
-          <w:bCs/>
-          <w:b/>
-        </w:rPr>
-        <w:t xml:space="preserve">13 de marzo de 2025</w:t>
-      </w:r>
-      <w:r>
-        <w:t xml:space="preserve"> </w:t>
-      </w:r>
-      <w:r>
-        <w:t xml:space="preserve">(Carta N.° 13032025) y del</w:t>
-      </w:r>
-      <w:r>
-        <w:t xml:space="preserve"> </w:t>
-      </w:r>
-      <w:r>
-        <w:rPr>
-          <w:bCs/>
-          <w:b/>
-        </w:rPr>
-        <w:t xml:space="preserve">28 de abril de 2025</w:t>
-      </w:r>
-      <w:r>
-        <w:t xml:space="preserve"> </w:t>
-      </w:r>
-      <w:r>
-        <w:t xml:space="preserve">(Carta N.° 28042025), en las que señalamos que el área de Logística</w:t>
+        <w:t xml:space="preserve">Precisamente porque la Municipalidad no lo puso por escrito,</w:t>
+      </w:r>
+      <w:r>
+        <w:t xml:space="preserve"> </w:t>
+      </w:r>
+      <w:r>
+        <w:rPr>
+          <w:bCs/>
+          <w:b/>
+        </w:rPr>
+        <w:t xml:space="preserve">lo reportamos nosotros, por escrito, en múltiples cartas</w:t>
+      </w:r>
+      <w:r>
+        <w:t xml:space="preserve">: a la Municipalidad el</w:t>
+      </w:r>
+      <w:r>
+        <w:t xml:space="preserve"> </w:t>
+      </w:r>
+      <w:r>
+        <w:rPr>
+          <w:bCs/>
+          <w:b/>
+        </w:rPr>
+        <w:t xml:space="preserve">13/03/2025</w:t>
+      </w:r>
+      <w:r>
+        <w:t xml:space="preserve"> </w:t>
+      </w:r>
+      <w:r>
+        <w:t xml:space="preserve">y el</w:t>
+      </w:r>
+      <w:r>
+        <w:t xml:space="preserve"> </w:t>
+      </w:r>
+      <w:r>
+        <w:rPr>
+          <w:bCs/>
+          <w:b/>
+        </w:rPr>
+        <w:t xml:space="preserve">28/04/2025</w:t>
+      </w:r>
+      <w:r>
+        <w:t xml:space="preserve"> </w:t>
+      </w:r>
+      <w:r>
+        <w:t xml:space="preserve">(Anexos 1 y 2), con copia a su despacho; a PERÚ COMPRAS el</w:t>
+      </w:r>
+      <w:r>
+        <w:t xml:space="preserve"> </w:t>
+      </w:r>
+      <w:r>
+        <w:rPr>
+          <w:bCs/>
+          <w:b/>
+        </w:rPr>
+        <w:t xml:space="preserve">24/05/2024</w:t>
+      </w:r>
+      <w:r>
+        <w:t xml:space="preserve">, el</w:t>
+      </w:r>
+      <w:r>
+        <w:t xml:space="preserve"> </w:t>
+      </w:r>
+      <w:r>
+        <w:rPr>
+          <w:bCs/>
+          <w:b/>
+        </w:rPr>
+        <w:t xml:space="preserve">20/09/2024</w:t>
+      </w:r>
+      <w:r>
+        <w:t xml:space="preserve"> </w:t>
+      </w:r>
+      <w:r>
+        <w:t xml:space="preserve">y el</w:t>
+      </w:r>
+      <w:r>
+        <w:t xml:space="preserve"> </w:t>
+      </w:r>
+      <w:r>
+        <w:rPr>
+          <w:bCs/>
+          <w:b/>
+        </w:rPr>
+        <w:t xml:space="preserve">14/03/2025</w:t>
+      </w:r>
+      <w:r>
+        <w:t xml:space="preserve">; y a la Defensoría del Pueblo el</w:t>
+      </w:r>
+      <w:r>
+        <w:t xml:space="preserve"> </w:t>
+      </w:r>
+      <w:r>
+        <w:rPr>
+          <w:bCs/>
+          <w:b/>
+        </w:rPr>
+        <w:t xml:space="preserve">24/05/2024</w:t>
+      </w:r>
+      <w:r>
+        <w:t xml:space="preserve">. En todas ellas consignamos que el área de Logística</w:t>
       </w:r>
       <w:r>
         <w:t xml:space="preserve"> </w:t>
@@ -353,20 +424,17 @@
         <w:t xml:space="preserve">”</w:t>
       </w:r>
       <w:r>
-        <w:t xml:space="preserve"> </w:t>
-      </w:r>
-      <w:r>
-        <w:t xml:space="preserve">(Anexos 1 y 2).</w:t>
-      </w:r>
-      <w:r>
-        <w:t xml:space="preserve"> </w:t>
-      </w:r>
-      <w:r>
-        <w:rPr>
-          <w:bCs/>
-          <w:b/>
-        </w:rPr>
-        <w:t xml:space="preserve">Ninguna de esas cartas fue respondida ni desmentida por la Municipalidad.</w:t>
+        <w:t xml:space="preserve">.</w:t>
+      </w:r>
+      <w:r>
+        <w:t xml:space="preserve"> </w:t>
+      </w:r>
+      <w:r>
+        <w:rPr>
+          <w:bCs/>
+          <w:b/>
+        </w:rPr>
+        <w:t xml:space="preserve">La Municipalidad nunca respondió ni desmintió ese hecho.</w:t>
       </w:r>
     </w:p>
     <w:p>
@@ -375,20 +443,23 @@
         <w:jc w:val="both"/>
       </w:pPr>
       <w:r>
-        <w:t xml:space="preserve">Ponemos además en su conocimiento un</w:t>
-      </w:r>
-      <w:r>
-        <w:t xml:space="preserve"> </w:t>
-      </w:r>
-      <w:r>
-        <w:rPr>
-          <w:bCs/>
-          <w:b/>
-        </w:rPr>
-        <w:t xml:space="preserve">hecho nuevo</w:t>
-      </w:r>
-      <w:r>
-        <w:t xml:space="preserve">: el</w:t>
+        <w:t xml:space="preserve">No está a nuestro alcance presentar un documento que la propia entidad nunca emitió.</w:t>
+      </w:r>
+      <w:r>
+        <w:t xml:space="preserve"> </w:t>
+      </w:r>
+      <w:r>
+        <w:rPr>
+          <w:bCs/>
+          <w:b/>
+        </w:rPr>
+        <w:t xml:space="preserve">Corresponde a la Municipalidad explicar qué pasó con el expediente y, sobre todo, resolver el pago.</w:t>
+      </w:r>
+      <w:r>
+        <w:t xml:space="preserve"> </w:t>
+      </w:r>
+      <w:r>
+        <w:t xml:space="preserve">En todo caso, el</w:t>
       </w:r>
       <w:r>
         <w:t xml:space="preserve"> </w:t>
@@ -401,7 +472,10 @@
         <w:t xml:space="preserve">07 de octubre de 2026</w:t>
       </w:r>
       <w:r>
-        <w:t xml:space="preserve">, la Municipalidad registró nuestra Carta N.° 07102026-1, dirigida al Alcalde, como</w:t>
+        <w:t xml:space="preserve"> </w:t>
+      </w:r>
+      <w:r>
+        <w:t xml:space="preserve">la Municipalidad registró nuestra Carta N.° 07102026-1 como</w:t>
       </w:r>
       <w:r>
         <w:t xml:space="preserve"> </w:t>
@@ -430,20 +504,100 @@
         <w:t xml:space="preserve">EXP 655163</w:t>
       </w:r>
       <w:r>
-        <w:t xml:space="preserve">. Es decir,</w:t>
-      </w:r>
-      <w:r>
-        <w:t xml:space="preserve"> </w:t>
-      </w:r>
-      <w:r>
-        <w:rPr>
-          <w:bCs/>
-          <w:b/>
-        </w:rPr>
-        <w:t xml:space="preserve">el expediente figura activo en el Sistema de Gestión Documentaria de la Municipalidad</w:t>
-      </w:r>
-      <w:r>
-        <w:t xml:space="preserve">. Solicitamos que su despacho verifique en dicho expediente el trámite del pago y las razones por las que no se ha efectuado.</w:t>
+        <w:t xml:space="preserve">, lo que demuestra que</w:t>
+      </w:r>
+      <w:r>
+        <w:t xml:space="preserve"> </w:t>
+      </w:r>
+      <w:r>
+        <w:rPr>
+          <w:bCs/>
+          <w:b/>
+        </w:rPr>
+        <w:t xml:space="preserve">el expediente figura activo en su Sistema de Gestión Documentaria</w:t>
+      </w:r>
+      <w:r>
+        <w:t xml:space="preserve">. Solicitamos a su despacho</w:t>
+      </w:r>
+      <w:r>
+        <w:t xml:space="preserve"> </w:t>
+      </w:r>
+      <w:r>
+        <w:rPr>
+          <w:bCs/>
+          <w:b/>
+        </w:rPr>
+        <w:t xml:space="preserve">verificar directamente en ese expediente</w:t>
+      </w:r>
+      <w:r>
+        <w:t xml:space="preserve"> </w:t>
+      </w:r>
+      <w:r>
+        <w:t xml:space="preserve">el trámite del pago y las razones por las que, después de más de tres años,</w:t>
+      </w:r>
+      <w:r>
+        <w:t xml:space="preserve"> </w:t>
+      </w:r>
+      <w:r>
+        <w:rPr>
+          <w:bCs/>
+          <w:b/>
+        </w:rPr>
+        <w:t xml:space="preserve">no se ha pagado</w:t>
+      </w:r>
+      <w:r>
+        <w:t xml:space="preserve">.</w:t>
+      </w:r>
+    </w:p>
+    <w:p>
+      <w:pPr>
+        <w:pStyle w:val="BodyText"/>
+        <w:jc w:val="both"/>
+      </w:pPr>
+      <w:r>
+        <w:rPr>
+          <w:bCs/>
+          <w:b/>
+        </w:rPr>
+        <w:t xml:space="preserve">Lo que esperamos de su despacho no es un trámite más, sino una solución:</w:t>
+      </w:r>
+      <w:r>
+        <w:t xml:space="preserve"> </w:t>
+      </w:r>
+      <w:r>
+        <w:t xml:space="preserve">que la Municipalidad</w:t>
+      </w:r>
+      <w:r>
+        <w:t xml:space="preserve"> </w:t>
+      </w:r>
+      <w:r>
+        <w:rPr>
+          <w:bCs/>
+          <w:b/>
+        </w:rPr>
+        <w:t xml:space="preserve">pague lo que debe</w:t>
+      </w:r>
+      <w:r>
+        <w:t xml:space="preserve"> </w:t>
+      </w:r>
+      <w:r>
+        <w:t xml:space="preserve">y que se determine</w:t>
+      </w:r>
+      <w:r>
+        <w:t xml:space="preserve"> </w:t>
+      </w:r>
+      <w:r>
+        <w:rPr>
+          <w:bCs/>
+          <w:b/>
+        </w:rPr>
+        <w:t xml:space="preserve">qué pasó con el giro de S/ 3,482.27</w:t>
+      </w:r>
+      <w:r>
+        <w:t xml:space="preserve"> </w:t>
+      </w:r>
+      <w:r>
+        <w:t xml:space="preserve">registrado en el SIAF (Expediente SIAF N.° 3618-2022) que nunca llegó a nuestra empresa.</w:t>
       </w:r>
     </w:p>
     <w:p>

</xml_diff>

<commit_message>
Huacho OCI: precisión sobre el número de expediente SIAF
Co-Authored-By: Claude Opus 5.5 <noreply@anthropic.com>
Claude-Session: https://claude.ai/code/session_01Ls5dNjYBLNjXxuGTDk7v3H
</commit_message>
<xml_diff>
--- a/carta-reclamo/huacho/Carta_Huacho_OCI_Complemento.docx
+++ b/carta-reclamo/huacho/Carta_Huacho_OCI_Complemento.docx
@@ -952,6 +952,68 @@
       </w:r>
       <w:r>
         <w:t xml:space="preserve">de la Titular Gerente (Anexo 6).</w:t>
+      </w:r>
+    </w:p>
+    <w:p>
+      <w:pPr>
+        <w:pStyle w:val="BodyText"/>
+        <w:jc w:val="both"/>
+      </w:pPr>
+      <w:r>
+        <w:rPr>
+          <w:bCs/>
+          <w:b/>
+        </w:rPr>
+        <w:t xml:space="preserve">5. Precisión sobre el número de expediente SIAF.</w:t>
+      </w:r>
+      <w:r>
+        <w:t xml:space="preserve"> </w:t>
+      </w:r>
+      <w:r>
+        <w:t xml:space="preserve">El número correcto del expediente es</w:t>
+      </w:r>
+      <w:r>
+        <w:t xml:space="preserve"> </w:t>
+      </w:r>
+      <w:r>
+        <w:rPr>
+          <w:bCs/>
+          <w:b/>
+        </w:rPr>
+        <w:t xml:space="preserve">SIAF N.° 3618-2022</w:t>
+      </w:r>
+      <w:r>
+        <w:t xml:space="preserve"> </w:t>
+      </w:r>
+      <w:r>
+        <w:t xml:space="preserve">(Municipalidad Provincial de Huaura, entidad 301371), en el que figura el giro de S/ 3,482.27 del 26/01/2023 (documento N.° 0103). En nuestras Cartas N.° 07102026-1 y siguientes se consignó por error</w:t>
+      </w:r>
+      <w:r>
+        <w:t xml:space="preserve"> </w:t>
+      </w:r>
+      <w:r>
+        <w:rPr>
+          <w:bCs/>
+          <w:b/>
+        </w:rPr>
+        <w:t xml:space="preserve">“</w:t>
+      </w:r>
+      <w:r>
+        <w:rPr>
+          <w:bCs/>
+          <w:b/>
+        </w:rPr>
+        <w:t xml:space="preserve">3619-2022</w:t>
+      </w:r>
+      <w:r>
+        <w:rPr>
+          <w:bCs/>
+          <w:b/>
+        </w:rPr>
+        <w:t xml:space="preserve">”</w:t>
+      </w:r>
+      <w:r>
+        <w:t xml:space="preserve">; los demás datos (Orden de Compra N.° 000146, OCAM-2022-301371-25-0, montos y fechas) son correctos y permiten identificar la operación sin lugar a dudas.</w:t>
       </w:r>
     </w:p>
     <w:p>

</xml_diff>